<commit_message>
Add researched supplier contacts with reliability ratings
Records the email addresses and phone numbers found for the suppliers,
each labelled by how well it is corroborated, with an explicit note that
most official Contact pages could not be opened for direct verification
and addresses should be confirmed by phone before an important letter.

Also states plainly that the special-access contractor and the balloon
operator have no single official address and must be sourced through a
licensed DMC, which makes letter 02 a prerequisite for letters 03, 04
and 09.

Co-Authored-By: Claude Opus 5 <noreply@anthropic.com>
Claude-Session: https://claude.ai/code/session_01KQFm1d6HbwvN6nT4uerjN3
</commit_message>
<xml_diff>
--- a/egypt-jan-2027/Письма_и_контакты.docx
+++ b/egypt-jan-2027/Письма_и_контакты.docx
@@ -1534,6 +1534,1007 @@
       </w:r>
       <w:r>
         <w:t xml:space="preserve"> — по этому списку вы проверяете, полон ли ответ.</w:t>
+      </w:r>
+    </w:p>
+    <w:p>
+      <w:pPr>
+        <w:pBdr>
+          <w:bottom w:val="single" w:sz="6" w:space="1" w:color="BFBFBF"/>
+        </w:pBdr>
+        <w:spacing w:after="200"/>
+      </w:pPr>
+    </w:p>
+    <w:p>
+      <w:pPr>
+        <w:spacing w:before="320" w:after="120"/>
+      </w:pPr>
+      <w:r>
+        <w:rPr>
+          <w:b/>
+          <w:color w:val="1F3864"/>
+          <w:sz w:val="29"/>
+        </w:rPr>
+        <w:t>НАЙДЕННЫЕ КОНТАКТЫ И ИХ НАДЁЖНОСТЬ</w:t>
+      </w:r>
+    </w:p>
+    <w:p>
+      <w:r>
+        <w:rPr>
+          <w:b/>
+        </w:rPr>
+        <w:t>Важная оговорка.</w:t>
+      </w:r>
+      <w:r>
+        <w:t xml:space="preserve"> Официальные сайты Mandarin Oriental, Oberoi, Abercrombie &amp; Kent и Marriott недоступны для прямой проверки из нашей среды. Поэтому адреса ниже взяты из поисковых результатов и B2B-справочников, а не со страниц Contact самих поставщиков. Перед отправкой важного письма </w:t>
+      </w:r>
+      <w:r>
+        <w:rPr>
+          <w:b/>
+        </w:rPr>
+        <w:t>подтвердите адрес звонком</w:t>
+      </w:r>
+      <w:r>
+        <w:t>. В Египте телефон для деловой переписки работает надёжнее почты: звоните на ресепшн и просите адрес нужного отдела.</w:t>
+      </w:r>
+    </w:p>
+    <w:tbl>
+      <w:tblPr>
+        <w:tblStyle w:val="TableGrid"/>
+        <w:tblW w:type="auto" w:w="0"/>
+        <w:jc w:val="center"/>
+        <w:tblLook w:firstColumn="1" w:firstRow="1" w:lastColumn="0" w:lastRow="0" w:noHBand="0" w:noVBand="1" w:val="04A0"/>
+      </w:tblPr>
+      <w:tblGrid>
+        <w:gridCol w:w="3286"/>
+        <w:gridCol w:w="3286"/>
+        <w:gridCol w:w="3286"/>
+      </w:tblGrid>
+      <w:tr>
+        <w:tc>
+          <w:tcPr>
+            <w:tcW w:type="dxa" w:w="3286"/>
+            <w:shd w:val="clear" w:fill="1F3864"/>
+          </w:tcPr>
+          <w:p>
+            <w:pPr>
+              <w:spacing w:after="40"/>
+            </w:pPr>
+            <w:r>
+              <w:rPr>
+                <w:b/>
+                <w:color w:val="FFFFFF"/>
+                <w:sz w:val="19"/>
+              </w:rPr>
+            </w:r>
+            <w:r>
+              <w:rPr>
+                <w:b/>
+                <w:color w:val="FFFFFF"/>
+                <w:sz w:val="19"/>
+              </w:rPr>
+              <w:t>Получатель</w:t>
+            </w:r>
+          </w:p>
+        </w:tc>
+        <w:tc>
+          <w:tcPr>
+            <w:tcW w:type="dxa" w:w="3286"/>
+            <w:shd w:val="clear" w:fill="1F3864"/>
+          </w:tcPr>
+          <w:p>
+            <w:pPr>
+              <w:spacing w:after="40"/>
+            </w:pPr>
+            <w:r>
+              <w:rPr>
+                <w:b/>
+                <w:color w:val="FFFFFF"/>
+                <w:sz w:val="19"/>
+              </w:rPr>
+            </w:r>
+            <w:r>
+              <w:rPr>
+                <w:b/>
+                <w:color w:val="FFFFFF"/>
+                <w:sz w:val="19"/>
+              </w:rPr>
+              <w:t>Контакт</w:t>
+            </w:r>
+          </w:p>
+        </w:tc>
+        <w:tc>
+          <w:tcPr>
+            <w:tcW w:type="dxa" w:w="3286"/>
+            <w:shd w:val="clear" w:fill="1F3864"/>
+          </w:tcPr>
+          <w:p>
+            <w:pPr>
+              <w:spacing w:after="40"/>
+            </w:pPr>
+            <w:r>
+              <w:rPr>
+                <w:b/>
+                <w:color w:val="FFFFFF"/>
+                <w:sz w:val="19"/>
+              </w:rPr>
+            </w:r>
+            <w:r>
+              <w:rPr>
+                <w:b/>
+                <w:color w:val="FFFFFF"/>
+                <w:sz w:val="19"/>
+              </w:rPr>
+              <w:t>Надёжность</w:t>
+            </w:r>
+          </w:p>
+        </w:tc>
+      </w:tr>
+      <w:tr>
+        <w:tc>
+          <w:tcPr>
+            <w:tcW w:type="dxa" w:w="3286"/>
+          </w:tcPr>
+          <w:p>
+            <w:pPr>
+              <w:spacing w:after="40"/>
+            </w:pPr>
+            <w:r>
+              <w:rPr>
+                <w:sz w:val="19"/>
+              </w:rPr>
+            </w:r>
+            <w:r>
+              <w:rPr>
+                <w:b/>
+                <w:sz w:val="19"/>
+              </w:rPr>
+              <w:t>Oberoi Philae / Oberoi Zahra</w:t>
+            </w:r>
+          </w:p>
+        </w:tc>
+        <w:tc>
+          <w:tcPr>
+            <w:tcW w:type="dxa" w:w="3286"/>
+          </w:tcPr>
+          <w:p>
+            <w:pPr>
+              <w:spacing w:after="40"/>
+            </w:pPr>
+            <w:r>
+              <w:rPr>
+                <w:sz w:val="19"/>
+              </w:rPr>
+            </w:r>
+            <w:r>
+              <w:rPr>
+                <w:rFonts w:ascii="Consolas" w:hAnsi="Consolas"/>
+                <w:sz w:val="19"/>
+              </w:rPr>
+              <w:t>reservations@oberoigroup.com</w:t>
+            </w:r>
+            <w:r>
+              <w:rPr>
+                <w:sz w:val="19"/>
+              </w:rPr>
+              <w:t xml:space="preserve"> — центральная служба бронирования группы Oberoi</w:t>
+            </w:r>
+          </w:p>
+        </w:tc>
+        <w:tc>
+          <w:tcPr>
+            <w:tcW w:type="dxa" w:w="3286"/>
+          </w:tcPr>
+          <w:p>
+            <w:pPr>
+              <w:spacing w:after="40"/>
+            </w:pPr>
+            <w:r>
+              <w:rPr>
+                <w:sz w:val="19"/>
+              </w:rPr>
+            </w:r>
+            <w:r>
+              <w:rPr>
+                <w:sz w:val="19"/>
+              </w:rPr>
+              <w:t>высокая, адрес широко публикуется</w:t>
+            </w:r>
+          </w:p>
+        </w:tc>
+      </w:tr>
+      <w:tr>
+        <w:tc>
+          <w:tcPr>
+            <w:tcW w:type="dxa" w:w="3286"/>
+            <w:shd w:val="clear" w:fill="F2F5FA"/>
+          </w:tcPr>
+          <w:p>
+            <w:pPr>
+              <w:spacing w:after="40"/>
+            </w:pPr>
+            <w:r>
+              <w:rPr>
+                <w:sz w:val="19"/>
+              </w:rPr>
+            </w:r>
+            <w:r>
+              <w:rPr>
+                <w:b/>
+                <w:sz w:val="19"/>
+              </w:rPr>
+              <w:t>Marriott Mena House, Cairo</w:t>
+            </w:r>
+          </w:p>
+        </w:tc>
+        <w:tc>
+          <w:tcPr>
+            <w:tcW w:type="dxa" w:w="3286"/>
+            <w:shd w:val="clear" w:fill="F2F5FA"/>
+          </w:tcPr>
+          <w:p>
+            <w:pPr>
+              <w:spacing w:after="40"/>
+            </w:pPr>
+            <w:r>
+              <w:rPr>
+                <w:sz w:val="19"/>
+              </w:rPr>
+            </w:r>
+            <w:r>
+              <w:rPr>
+                <w:rFonts w:ascii="Consolas" w:hAnsi="Consolas"/>
+                <w:sz w:val="19"/>
+              </w:rPr>
+              <w:t>mhrs.caimn.reservations@marriott.com</w:t>
+            </w:r>
+            <w:r>
+              <w:rPr>
+                <w:sz w:val="19"/>
+              </w:rPr>
+              <w:t xml:space="preserve">, </w:t>
+            </w:r>
+            <w:r>
+              <w:rPr>
+                <w:rFonts w:ascii="Consolas" w:hAnsi="Consolas"/>
+                <w:sz w:val="19"/>
+              </w:rPr>
+              <w:t>mhrs.caimn.guestrelations@marriott.com</w:t>
+            </w:r>
+            <w:r>
+              <w:rPr>
+                <w:sz w:val="19"/>
+              </w:rPr>
+              <w:t>. Телефон +20 2 3377 3222, факс +20 2 3377 5411. Код отеля CAIMN</w:t>
+            </w:r>
+          </w:p>
+        </w:tc>
+        <w:tc>
+          <w:tcPr>
+            <w:tcW w:type="dxa" w:w="3286"/>
+            <w:shd w:val="clear" w:fill="F2F5FA"/>
+          </w:tcPr>
+          <w:p>
+            <w:pPr>
+              <w:spacing w:after="40"/>
+            </w:pPr>
+            <w:r>
+              <w:rPr>
+                <w:sz w:val="19"/>
+              </w:rPr>
+            </w:r>
+            <w:r>
+              <w:rPr>
+                <w:sz w:val="19"/>
+              </w:rPr>
+              <w:t>высокая: формат соответствует стандарту Marriott, код отеля подтверждён по URL на marriott.com</w:t>
+            </w:r>
+          </w:p>
+        </w:tc>
+      </w:tr>
+      <w:tr>
+        <w:tc>
+          <w:tcPr>
+            <w:tcW w:type="dxa" w:w="3286"/>
+          </w:tcPr>
+          <w:p>
+            <w:pPr>
+              <w:spacing w:after="40"/>
+            </w:pPr>
+            <w:r>
+              <w:rPr>
+                <w:sz w:val="19"/>
+              </w:rPr>
+            </w:r>
+            <w:r>
+              <w:rPr>
+                <w:b/>
+                <w:sz w:val="19"/>
+              </w:rPr>
+              <w:t>Mövenpick Resort Aswan</w:t>
+            </w:r>
+          </w:p>
+        </w:tc>
+        <w:tc>
+          <w:tcPr>
+            <w:tcW w:type="dxa" w:w="3286"/>
+          </w:tcPr>
+          <w:p>
+            <w:pPr>
+              <w:spacing w:after="40"/>
+            </w:pPr>
+            <w:r>
+              <w:rPr>
+                <w:sz w:val="19"/>
+              </w:rPr>
+            </w:r>
+            <w:r>
+              <w:rPr>
+                <w:rFonts w:ascii="Consolas" w:hAnsi="Consolas"/>
+                <w:sz w:val="19"/>
+              </w:rPr>
+              <w:t>resort.aswan@movenpick.com</w:t>
+            </w:r>
+            <w:r>
+              <w:rPr>
+                <w:sz w:val="19"/>
+              </w:rPr>
+              <w:t>. Телефон +20 97 245 4455</w:t>
+            </w:r>
+          </w:p>
+        </w:tc>
+        <w:tc>
+          <w:tcPr>
+            <w:tcW w:type="dxa" w:w="3286"/>
+          </w:tcPr>
+          <w:p>
+            <w:pPr>
+              <w:spacing w:after="40"/>
+            </w:pPr>
+            <w:r>
+              <w:rPr>
+                <w:sz w:val="19"/>
+              </w:rPr>
+            </w:r>
+            <w:r>
+              <w:rPr>
+                <w:sz w:val="19"/>
+              </w:rPr>
+              <w:t>средняя, формат соответствует стандарту Mövenpick</w:t>
+            </w:r>
+          </w:p>
+        </w:tc>
+      </w:tr>
+      <w:tr>
+        <w:tc>
+          <w:tcPr>
+            <w:tcW w:type="dxa" w:w="3286"/>
+            <w:shd w:val="clear" w:fill="F2F5FA"/>
+          </w:tcPr>
+          <w:p>
+            <w:pPr>
+              <w:spacing w:after="40"/>
+            </w:pPr>
+            <w:r>
+              <w:rPr>
+                <w:sz w:val="19"/>
+              </w:rPr>
+            </w:r>
+            <w:r>
+              <w:rPr>
+                <w:b/>
+                <w:sz w:val="19"/>
+              </w:rPr>
+              <w:t>Hilton Luxor Resort &amp; Spa</w:t>
+            </w:r>
+          </w:p>
+        </w:tc>
+        <w:tc>
+          <w:tcPr>
+            <w:tcW w:type="dxa" w:w="3286"/>
+            <w:shd w:val="clear" w:fill="F2F5FA"/>
+          </w:tcPr>
+          <w:p>
+            <w:pPr>
+              <w:spacing w:after="40"/>
+            </w:pPr>
+            <w:r>
+              <w:rPr>
+                <w:sz w:val="19"/>
+              </w:rPr>
+            </w:r>
+            <w:r>
+              <w:rPr>
+                <w:sz w:val="19"/>
+              </w:rPr>
+              <w:t xml:space="preserve">Телефон +20 95 239 9999. Код отеля LUXHITW. Адрес отдела групп не подтверждён, </w:t>
+            </w:r>
+            <w:r>
+              <w:rPr>
+                <w:b/>
+                <w:sz w:val="19"/>
+              </w:rPr>
+              <w:t>не угадывать</w:t>
+            </w:r>
+          </w:p>
+        </w:tc>
+        <w:tc>
+          <w:tcPr>
+            <w:tcW w:type="dxa" w:w="3286"/>
+            <w:shd w:val="clear" w:fill="F2F5FA"/>
+          </w:tcPr>
+          <w:p>
+            <w:pPr>
+              <w:spacing w:after="40"/>
+            </w:pPr>
+            <w:r>
+              <w:rPr>
+                <w:sz w:val="19"/>
+              </w:rPr>
+            </w:r>
+            <w:r>
+              <w:rPr>
+                <w:sz w:val="19"/>
+              </w:rPr>
+              <w:t>телефон средняя, почта не найдена</w:t>
+            </w:r>
+          </w:p>
+        </w:tc>
+      </w:tr>
+      <w:tr>
+        <w:tc>
+          <w:tcPr>
+            <w:tcW w:type="dxa" w:w="3286"/>
+          </w:tcPr>
+          <w:p>
+            <w:pPr>
+              <w:spacing w:after="40"/>
+            </w:pPr>
+            <w:r>
+              <w:rPr>
+                <w:sz w:val="19"/>
+              </w:rPr>
+            </w:r>
+            <w:r>
+              <w:rPr>
+                <w:b/>
+                <w:sz w:val="19"/>
+              </w:rPr>
+              <w:t>Mandarin Oriental, Old Cataract, Aswan</w:t>
+            </w:r>
+          </w:p>
+        </w:tc>
+        <w:tc>
+          <w:tcPr>
+            <w:tcW w:type="dxa" w:w="3286"/>
+          </w:tcPr>
+          <w:p>
+            <w:pPr>
+              <w:spacing w:after="40"/>
+            </w:pPr>
+            <w:r>
+              <w:rPr>
+                <w:sz w:val="19"/>
+              </w:rPr>
+            </w:r>
+            <w:r>
+              <w:rPr>
+                <w:sz w:val="19"/>
+              </w:rPr>
+              <w:t>Адрес не найден. Действовать через форму на mandarinoriental.com/en/aswan/old-cataract/contact-us либо звонком на ресепшн с просьбой дать адрес Events &amp; Catering</w:t>
+            </w:r>
+          </w:p>
+        </w:tc>
+        <w:tc>
+          <w:tcPr>
+            <w:tcW w:type="dxa" w:w="3286"/>
+          </w:tcPr>
+          <w:p>
+            <w:pPr>
+              <w:spacing w:after="40"/>
+            </w:pPr>
+            <w:r>
+              <w:rPr>
+                <w:sz w:val="19"/>
+              </w:rPr>
+            </w:r>
+            <w:r>
+              <w:rPr>
+                <w:sz w:val="19"/>
+              </w:rPr>
+              <w:t>адрес не найден</w:t>
+            </w:r>
+          </w:p>
+        </w:tc>
+      </w:tr>
+      <w:tr>
+        <w:tc>
+          <w:tcPr>
+            <w:tcW w:type="dxa" w:w="3286"/>
+            <w:shd w:val="clear" w:fill="F2F5FA"/>
+          </w:tcPr>
+          <w:p>
+            <w:pPr>
+              <w:spacing w:after="40"/>
+            </w:pPr>
+            <w:r>
+              <w:rPr>
+                <w:sz w:val="19"/>
+              </w:rPr>
+            </w:r>
+            <w:r>
+              <w:rPr>
+                <w:b/>
+                <w:sz w:val="19"/>
+              </w:rPr>
+              <w:t>Abercrombie &amp; Kent Egypt / Sun Boat III</w:t>
+            </w:r>
+          </w:p>
+        </w:tc>
+        <w:tc>
+          <w:tcPr>
+            <w:tcW w:type="dxa" w:w="3286"/>
+            <w:shd w:val="clear" w:fill="F2F5FA"/>
+          </w:tcPr>
+          <w:p>
+            <w:pPr>
+              <w:spacing w:after="40"/>
+            </w:pPr>
+            <w:r>
+              <w:rPr>
+                <w:sz w:val="19"/>
+              </w:rPr>
+            </w:r>
+            <w:r>
+              <w:rPr>
+                <w:sz w:val="19"/>
+              </w:rPr>
+              <w:t>Офис: 2 Talaat Harb, 7-й этаж, Каир. Телефоны +20 2 2394 7701 и +20 2 2394 7777. Домен переписки abercrombiekent.com.eg. Также у A&amp;K есть подразделение AKDMC MICE</w:t>
+            </w:r>
+          </w:p>
+        </w:tc>
+        <w:tc>
+          <w:tcPr>
+            <w:tcW w:type="dxa" w:w="3286"/>
+            <w:shd w:val="clear" w:fill="F2F5FA"/>
+          </w:tcPr>
+          <w:p>
+            <w:pPr>
+              <w:spacing w:after="40"/>
+            </w:pPr>
+            <w:r>
+              <w:rPr>
+                <w:sz w:val="19"/>
+              </w:rPr>
+            </w:r>
+            <w:r>
+              <w:rPr>
+                <w:sz w:val="19"/>
+              </w:rPr>
+              <w:t>телефоны средняя. Персональный адрес из справочника не используем, звоним и просим отдел чартеров</w:t>
+            </w:r>
+          </w:p>
+        </w:tc>
+      </w:tr>
+      <w:tr>
+        <w:tc>
+          <w:tcPr>
+            <w:tcW w:type="dxa" w:w="3286"/>
+          </w:tcPr>
+          <w:p>
+            <w:pPr>
+              <w:spacing w:after="40"/>
+            </w:pPr>
+            <w:r>
+              <w:rPr>
+                <w:sz w:val="19"/>
+              </w:rPr>
+            </w:r>
+            <w:r>
+              <w:rPr>
+                <w:b/>
+                <w:sz w:val="19"/>
+              </w:rPr>
+              <w:t>EgyptAir, группы</w:t>
+            </w:r>
+          </w:p>
+        </w:tc>
+        <w:tc>
+          <w:tcPr>
+            <w:tcW w:type="dxa" w:w="3286"/>
+          </w:tcPr>
+          <w:p>
+            <w:pPr>
+              <w:spacing w:after="40"/>
+            </w:pPr>
+            <w:r>
+              <w:rPr>
+                <w:sz w:val="19"/>
+              </w:rPr>
+            </w:r>
+            <w:r>
+              <w:rPr>
+                <w:sz w:val="19"/>
+              </w:rPr>
+              <w:t>Официальная форма группового запроса: egyptair.com/en/Book/Pages/Group-Reservation.aspx. Минимум для группового тарифа 10 пассажиров</w:t>
+            </w:r>
+          </w:p>
+        </w:tc>
+        <w:tc>
+          <w:tcPr>
+            <w:tcW w:type="dxa" w:w="3286"/>
+          </w:tcPr>
+          <w:p>
+            <w:pPr>
+              <w:spacing w:after="40"/>
+            </w:pPr>
+            <w:r>
+              <w:rPr>
+                <w:sz w:val="19"/>
+              </w:rPr>
+            </w:r>
+            <w:r>
+              <w:rPr>
+                <w:sz w:val="19"/>
+              </w:rPr>
+              <w:t>высокая, форма на официальном сайте</w:t>
+            </w:r>
+          </w:p>
+        </w:tc>
+      </w:tr>
+      <w:tr>
+        <w:tc>
+          <w:tcPr>
+            <w:tcW w:type="dxa" w:w="3286"/>
+            <w:shd w:val="clear" w:fill="F2F5FA"/>
+          </w:tcPr>
+          <w:p>
+            <w:pPr>
+              <w:spacing w:after="40"/>
+            </w:pPr>
+            <w:r>
+              <w:rPr>
+                <w:sz w:val="19"/>
+              </w:rPr>
+            </w:r>
+            <w:r>
+              <w:rPr>
+                <w:b/>
+                <w:sz w:val="19"/>
+              </w:rPr>
+              <w:t>Билеты в Большой Египетский музей</w:t>
+            </w:r>
+          </w:p>
+        </w:tc>
+        <w:tc>
+          <w:tcPr>
+            <w:tcW w:type="dxa" w:w="3286"/>
+            <w:shd w:val="clear" w:fill="F2F5FA"/>
+          </w:tcPr>
+          <w:p>
+            <w:pPr>
+              <w:spacing w:after="40"/>
+            </w:pPr>
+            <w:r>
+              <w:rPr>
+                <w:sz w:val="19"/>
+              </w:rPr>
+            </w:r>
+            <w:r>
+              <w:rPr>
+                <w:sz w:val="19"/>
+              </w:rPr>
+              <w:t>visit-gem.com, единственный легальный продавец</w:t>
+            </w:r>
+          </w:p>
+        </w:tc>
+        <w:tc>
+          <w:tcPr>
+            <w:tcW w:type="dxa" w:w="3286"/>
+            <w:shd w:val="clear" w:fill="F2F5FA"/>
+          </w:tcPr>
+          <w:p>
+            <w:pPr>
+              <w:spacing w:after="40"/>
+            </w:pPr>
+            <w:r>
+              <w:rPr>
+                <w:sz w:val="19"/>
+              </w:rPr>
+            </w:r>
+            <w:r>
+              <w:rPr>
+                <w:sz w:val="19"/>
+              </w:rPr>
+              <w:t>высокая</w:t>
+            </w:r>
+          </w:p>
+        </w:tc>
+      </w:tr>
+      <w:tr>
+        <w:tc>
+          <w:tcPr>
+            <w:tcW w:type="dxa" w:w="3286"/>
+          </w:tcPr>
+          <w:p>
+            <w:pPr>
+              <w:spacing w:after="40"/>
+            </w:pPr>
+            <w:r>
+              <w:rPr>
+                <w:sz w:val="19"/>
+              </w:rPr>
+            </w:r>
+            <w:r>
+              <w:rPr>
+                <w:b/>
+                <w:sz w:val="19"/>
+              </w:rPr>
+              <w:t>Билеты на памятники</w:t>
+            </w:r>
+          </w:p>
+        </w:tc>
+        <w:tc>
+          <w:tcPr>
+            <w:tcW w:type="dxa" w:w="3286"/>
+          </w:tcPr>
+          <w:p>
+            <w:pPr>
+              <w:spacing w:after="40"/>
+            </w:pPr>
+            <w:r>
+              <w:rPr>
+                <w:sz w:val="19"/>
+              </w:rPr>
+            </w:r>
+            <w:r>
+              <w:rPr>
+                <w:sz w:val="19"/>
+              </w:rPr>
+              <w:t>egymonuments.gov.eg и egymonuments.com</w:t>
+            </w:r>
+          </w:p>
+        </w:tc>
+        <w:tc>
+          <w:tcPr>
+            <w:tcW w:type="dxa" w:w="3286"/>
+          </w:tcPr>
+          <w:p>
+            <w:pPr>
+              <w:spacing w:after="40"/>
+            </w:pPr>
+            <w:r>
+              <w:rPr>
+                <w:sz w:val="19"/>
+              </w:rPr>
+            </w:r>
+            <w:r>
+              <w:rPr>
+                <w:sz w:val="19"/>
+              </w:rPr>
+              <w:t>высокая</w:t>
+            </w:r>
+          </w:p>
+        </w:tc>
+      </w:tr>
+      <w:tr>
+        <w:tc>
+          <w:tcPr>
+            <w:tcW w:type="dxa" w:w="3286"/>
+            <w:shd w:val="clear" w:fill="F2F5FA"/>
+          </w:tcPr>
+          <w:p>
+            <w:pPr>
+              <w:spacing w:after="40"/>
+            </w:pPr>
+            <w:r>
+              <w:rPr>
+                <w:sz w:val="19"/>
+              </w:rPr>
+            </w:r>
+            <w:r>
+              <w:rPr>
+                <w:b/>
+                <w:sz w:val="19"/>
+              </w:rPr>
+              <w:t>Подрядчик спецдоступов: Гиза, Филе</w:t>
+            </w:r>
+          </w:p>
+        </w:tc>
+        <w:tc>
+          <w:tcPr>
+            <w:tcW w:type="dxa" w:w="3286"/>
+            <w:shd w:val="clear" w:fill="F2F5FA"/>
+          </w:tcPr>
+          <w:p>
+            <w:pPr>
+              <w:spacing w:after="40"/>
+            </w:pPr>
+            <w:r>
+              <w:rPr>
+                <w:sz w:val="19"/>
+              </w:rPr>
+            </w:r>
+            <w:r>
+              <w:rPr>
+                <w:sz w:val="19"/>
+              </w:rPr>
+              <w:t>Единого официального адреса не существует. Эти услуги оформляются только через лицензированные компании с доступом к разрешительным органам. Запросите контакт у 2–3 DMC и потребуйте примеры ранее оформленных ночных разрешений</w:t>
+            </w:r>
+          </w:p>
+        </w:tc>
+        <w:tc>
+          <w:tcPr>
+            <w:tcW w:type="dxa" w:w="3286"/>
+            <w:shd w:val="clear" w:fill="F2F5FA"/>
+          </w:tcPr>
+          <w:p>
+            <w:pPr>
+              <w:spacing w:after="40"/>
+            </w:pPr>
+            <w:r>
+              <w:rPr>
+                <w:sz w:val="19"/>
+              </w:rPr>
+            </w:r>
+            <w:r>
+              <w:rPr>
+                <w:sz w:val="19"/>
+              </w:rPr>
+              <w:t>получать через DMC</w:t>
+            </w:r>
+          </w:p>
+        </w:tc>
+      </w:tr>
+      <w:tr>
+        <w:tc>
+          <w:tcPr>
+            <w:tcW w:type="dxa" w:w="3286"/>
+          </w:tcPr>
+          <w:p>
+            <w:pPr>
+              <w:spacing w:after="40"/>
+            </w:pPr>
+            <w:r>
+              <w:rPr>
+                <w:sz w:val="19"/>
+              </w:rPr>
+            </w:r>
+            <w:r>
+              <w:rPr>
+                <w:b/>
+                <w:sz w:val="19"/>
+              </w:rPr>
+              <w:t>Оператор воздушных шаров, Луксор</w:t>
+            </w:r>
+          </w:p>
+        </w:tc>
+        <w:tc>
+          <w:tcPr>
+            <w:tcW w:type="dxa" w:w="3286"/>
+          </w:tcPr>
+          <w:p>
+            <w:pPr>
+              <w:spacing w:after="40"/>
+            </w:pPr>
+            <w:r>
+              <w:rPr>
+                <w:sz w:val="19"/>
+              </w:rPr>
+            </w:r>
+            <w:r>
+              <w:rPr>
+                <w:sz w:val="19"/>
+              </w:rPr>
+              <w:t>Единого официального реестра в открытом доступе нет. Получить список лицензированных операторов у DMC и проверить лицензию Управления гражданской авиации Египта</w:t>
+            </w:r>
+          </w:p>
+        </w:tc>
+        <w:tc>
+          <w:tcPr>
+            <w:tcW w:type="dxa" w:w="3286"/>
+          </w:tcPr>
+          <w:p>
+            <w:pPr>
+              <w:spacing w:after="40"/>
+            </w:pPr>
+            <w:r>
+              <w:rPr>
+                <w:sz w:val="19"/>
+              </w:rPr>
+            </w:r>
+            <w:r>
+              <w:rPr>
+                <w:sz w:val="19"/>
+              </w:rPr>
+              <w:t>получать через DMC</w:t>
+            </w:r>
+          </w:p>
+        </w:tc>
+      </w:tr>
+      <w:tr>
+        <w:tc>
+          <w:tcPr>
+            <w:tcW w:type="dxa" w:w="3286"/>
+            <w:shd w:val="clear" w:fill="F2F5FA"/>
+          </w:tcPr>
+          <w:p>
+            <w:pPr>
+              <w:spacing w:after="40"/>
+            </w:pPr>
+            <w:r>
+              <w:rPr>
+                <w:sz w:val="19"/>
+              </w:rPr>
+            </w:r>
+            <w:r>
+              <w:rPr>
+                <w:b/>
+                <w:sz w:val="19"/>
+              </w:rPr>
+              <w:t>Дахабии</w:t>
+            </w:r>
+          </w:p>
+        </w:tc>
+        <w:tc>
+          <w:tcPr>
+            <w:tcW w:type="dxa" w:w="3286"/>
+            <w:shd w:val="clear" w:fill="F2F5FA"/>
+          </w:tcPr>
+          <w:p>
+            <w:pPr>
+              <w:spacing w:after="40"/>
+            </w:pPr>
+            <w:r>
+              <w:rPr>
+                <w:sz w:val="19"/>
+              </w:rPr>
+            </w:r>
+            <w:r>
+              <w:rPr>
+                <w:sz w:val="19"/>
+              </w:rPr>
+              <w:t>Контакты брать на сайте каждого оператора. Учтите: A&amp;K владеет также Zein Nile Chateau, то есть часть дахабий запрашивается через A&amp;K</w:t>
+            </w:r>
+          </w:p>
+        </w:tc>
+        <w:tc>
+          <w:tcPr>
+            <w:tcW w:type="dxa" w:w="3286"/>
+            <w:shd w:val="clear" w:fill="F2F5FA"/>
+          </w:tcPr>
+          <w:p>
+            <w:pPr>
+              <w:spacing w:after="40"/>
+            </w:pPr>
+            <w:r>
+              <w:rPr>
+                <w:sz w:val="19"/>
+              </w:rPr>
+            </w:r>
+            <w:r>
+              <w:rPr>
+                <w:sz w:val="19"/>
+              </w:rPr>
+              <w:t>проверять по каждому борту</w:t>
+            </w:r>
+          </w:p>
+        </w:tc>
+      </w:tr>
+    </w:tbl>
+    <w:p>
+      <w:pPr>
+        <w:spacing w:after="80"/>
+      </w:pPr>
+    </w:p>
+    <w:p>
+      <w:r>
+        <w:rPr>
+          <w:b/>
+        </w:rPr>
+        <w:t>Вывод по контактам.</w:t>
+      </w:r>
+      <w:r>
+        <w:t xml:space="preserve"> Три адреса можно использовать сразу: Oberoi, Marriott и Mövenpick. По Old Cataract, Hilton и A&amp;K сначала звонок, потом письмо. По спецдоступам и шару адреса получаются только через принимающую компанию, поэтому письмо 02 по факту разблокирует письма 03, 04 и 09.</w:t>
       </w:r>
     </w:p>
     <w:p>

</xml_diff>